<commit_message>
609 working on section 2
</commit_message>
<xml_diff>
--- a/2026-T3/B2-ICTSAD609-Plan_Monitor/2-Task2/611-Task2-section1.docx
+++ b/2026-T3/B2-ICTSAD609-Plan_Monitor/2-Task2/611-Task2-section1.docx
@@ -8828,6 +8828,121 @@
     </w:p>
     <w:p>
       <w:pPr>
+        <w:pStyle w:val="ListParagraph"/>
+        <w:rPr>
+          <w:rFonts w:ascii="Arial" w:hAnsi="Arial" w:cs="Arial"/>
+          <w:color w:val="000000" w:themeColor="text1"/>
+        </w:rPr>
+      </w:pPr>
+    </w:p>
+    <w:p>
+      <w:pPr>
+        <w:rPr>
+          <w:rFonts w:ascii="Arial" w:hAnsi="Arial" w:cs="Arial"/>
+          <w:b/>
+          <w:bCs/>
+          <w:color w:val="000000" w:themeColor="text1"/>
+        </w:rPr>
+      </w:pPr>
+      <w:r>
+        <w:rPr>
+          <w:rFonts w:ascii="Arial" w:hAnsi="Arial" w:cs="Arial"/>
+          <w:b/>
+          <w:bCs/>
+          <w:color w:val="000000" w:themeColor="text1"/>
+        </w:rPr>
+        <w:t>Feedback Summary:</w:t>
+      </w:r>
+    </w:p>
+    <w:p>
+      <w:pPr>
+        <w:rPr>
+          <w:rFonts w:ascii="Arial" w:hAnsi="Arial" w:cs="Arial"/>
+          <w:color w:val="000000" w:themeColor="text1"/>
+        </w:rPr>
+      </w:pPr>
+    </w:p>
+    <w:p>
+      <w:pPr>
+        <w:pStyle w:val="ListParagraph"/>
+        <w:numPr>
+          <w:ilvl w:val="0"/>
+          <w:numId w:val="20"/>
+        </w:numPr>
+        <w:rPr>
+          <w:rFonts w:ascii="Arial" w:hAnsi="Arial" w:cs="Arial"/>
+          <w:color w:val="000000" w:themeColor="text1"/>
+        </w:rPr>
+      </w:pPr>
+      <w:r>
+        <w:rPr>
+          <w:rFonts w:ascii="Arial" w:hAnsi="Arial" w:cs="Arial"/>
+          <w:color w:val="000000" w:themeColor="text1"/>
+        </w:rPr>
+        <w:t xml:space="preserve">Noah Jones (Operations Team Manager): Supports the move to bypass the production blockade in Hong Kong and fulfill pending orders, but warns of serious technical risks. It required that the business analysis establish exactly how order routing between the new manufacturers and </w:t>
+      </w:r>
+      <w:proofErr w:type="spellStart"/>
+      <w:r>
+        <w:rPr>
+          <w:rFonts w:ascii="Arial" w:hAnsi="Arial" w:cs="Arial"/>
+          <w:color w:val="000000" w:themeColor="text1"/>
+        </w:rPr>
+        <w:t>Worlducation's</w:t>
+      </w:r>
+      <w:proofErr w:type="spellEnd"/>
+      <w:r>
+        <w:rPr>
+          <w:rFonts w:ascii="Arial" w:hAnsi="Arial" w:cs="Arial"/>
+          <w:color w:val="000000" w:themeColor="text1"/>
+        </w:rPr>
+        <w:t xml:space="preserve"> ERP system will be mapped and automated. Likewise, he stressed that all parties must submit to the New Supplier Policy to guarantee minimum payment terms of 30 days.</w:t>
+      </w:r>
+      <w:r>
+        <w:rPr>
+          <w:rFonts w:ascii="Arial" w:hAnsi="Arial" w:cs="Arial"/>
+          <w:color w:val="000000" w:themeColor="text1"/>
+        </w:rPr>
+        <w:br/>
+      </w:r>
+    </w:p>
+    <w:p>
+      <w:pPr>
+        <w:pStyle w:val="ListParagraph"/>
+        <w:numPr>
+          <w:ilvl w:val="0"/>
+          <w:numId w:val="20"/>
+        </w:numPr>
+        <w:rPr>
+          <w:rFonts w:ascii="Arial" w:hAnsi="Arial" w:cs="Arial"/>
+          <w:color w:val="000000" w:themeColor="text1"/>
+        </w:rPr>
+      </w:pPr>
+      <w:r>
+        <w:rPr>
+          <w:rFonts w:ascii="Arial" w:hAnsi="Arial" w:cs="Arial"/>
+          <w:color w:val="000000" w:themeColor="text1"/>
+        </w:rPr>
+        <w:t xml:space="preserve">Victorine </w:t>
+      </w:r>
+      <w:proofErr w:type="spellStart"/>
+      <w:r>
+        <w:rPr>
+          <w:rFonts w:ascii="Arial" w:hAnsi="Arial" w:cs="Arial"/>
+          <w:color w:val="000000" w:themeColor="text1"/>
+        </w:rPr>
+        <w:t>Satore</w:t>
+      </w:r>
+      <w:proofErr w:type="spellEnd"/>
+      <w:r>
+        <w:rPr>
+          <w:rFonts w:ascii="Arial" w:hAnsi="Arial" w:cs="Arial"/>
+          <w:color w:val="000000" w:themeColor="text1"/>
+        </w:rPr>
+        <w:t xml:space="preserve"> (Sales Team Manager): She was concerned about quality assurance to the more than 550 schools that are current clients. He agreed that the lost margin of $200 per outsourced unit is preferable to losing customers, but it required strict countermeasures. It demanded the design of Service Level Agreements (SLA) for hardware quality control, as well as definitive and reliable delivery schedules for the 1,500 tablets that are still backlogged from 2020.</w:t>
+      </w:r>
+    </w:p>
+    <w:p>
+      <w:pPr>
         <w:rPr>
           <w:rFonts w:ascii="Arial" w:hAnsi="Arial" w:cs="Arial"/>
           <w:color w:val="000000" w:themeColor="text1"/>
@@ -9012,15 +9127,7 @@
           <w:rFonts w:ascii="Arial" w:hAnsi="Arial" w:cs="Arial"/>
           <w:color w:val="000000" w:themeColor="text1"/>
         </w:rPr>
-        <w:t xml:space="preserve"> core values ​​of innovation and collaboration and supports the strategic priority of enhancing responsiveness to change. The Scrum framework also allows </w:t>
-      </w:r>
-      <w:r>
-        <w:rPr>
-          <w:rFonts w:ascii="Arial" w:hAnsi="Arial" w:cs="Arial"/>
-          <w:color w:val="000000" w:themeColor="text1"/>
-        </w:rPr>
-        <w:lastRenderedPageBreak/>
-        <w:t>the Development Team in Bulgaria to work in parallel with the Business Analysis activities in Sydney, maintaining alignment through sprint reviews and backlog refinement sessions.</w:t>
+        <w:t xml:space="preserve"> core values ​​of innovation and collaboration and supports the strategic priority of enhancing responsiveness to change. The Scrum framework also allows the Development Team in Bulgaria to work in parallel with the Business Analysis activities in Sydney, maintaining alignment through sprint reviews and backlog refinement sessions.</w:t>
       </w:r>
     </w:p>
     <w:p>
@@ -13322,6 +13429,95 @@
     </w:lvl>
   </w:abstractNum>
   <w:abstractNum w:abstractNumId="10" w15:restartNumberingAfterBreak="0">
+    <w:nsid w:val="320475E4"/>
+    <w:multiLevelType w:val="hybridMultilevel"/>
+    <w:tmpl w:val="C5F28CD0"/>
+    <w:lvl w:ilvl="0" w:tplc="0809000F">
+      <w:start w:val="1"/>
+      <w:numFmt w:val="decimal"/>
+      <w:lvlText w:val="%1."/>
+      <w:lvlJc w:val="left"/>
+      <w:pPr>
+        <w:ind w:left="720" w:hanging="360"/>
+      </w:pPr>
+      <w:rPr>
+        <w:rFonts w:hint="default"/>
+      </w:rPr>
+    </w:lvl>
+    <w:lvl w:ilvl="1" w:tplc="08090019" w:tentative="1">
+      <w:start w:val="1"/>
+      <w:numFmt w:val="lowerLetter"/>
+      <w:lvlText w:val="%2."/>
+      <w:lvlJc w:val="left"/>
+      <w:pPr>
+        <w:ind w:left="1440" w:hanging="360"/>
+      </w:pPr>
+    </w:lvl>
+    <w:lvl w:ilvl="2" w:tplc="0809001B" w:tentative="1">
+      <w:start w:val="1"/>
+      <w:numFmt w:val="lowerRoman"/>
+      <w:lvlText w:val="%3."/>
+      <w:lvlJc w:val="right"/>
+      <w:pPr>
+        <w:ind w:left="2160" w:hanging="180"/>
+      </w:pPr>
+    </w:lvl>
+    <w:lvl w:ilvl="3" w:tplc="0809000F" w:tentative="1">
+      <w:start w:val="1"/>
+      <w:numFmt w:val="decimal"/>
+      <w:lvlText w:val="%4."/>
+      <w:lvlJc w:val="left"/>
+      <w:pPr>
+        <w:ind w:left="2880" w:hanging="360"/>
+      </w:pPr>
+    </w:lvl>
+    <w:lvl w:ilvl="4" w:tplc="08090019" w:tentative="1">
+      <w:start w:val="1"/>
+      <w:numFmt w:val="lowerLetter"/>
+      <w:lvlText w:val="%5."/>
+      <w:lvlJc w:val="left"/>
+      <w:pPr>
+        <w:ind w:left="3600" w:hanging="360"/>
+      </w:pPr>
+    </w:lvl>
+    <w:lvl w:ilvl="5" w:tplc="0809001B" w:tentative="1">
+      <w:start w:val="1"/>
+      <w:numFmt w:val="lowerRoman"/>
+      <w:lvlText w:val="%6."/>
+      <w:lvlJc w:val="right"/>
+      <w:pPr>
+        <w:ind w:left="4320" w:hanging="180"/>
+      </w:pPr>
+    </w:lvl>
+    <w:lvl w:ilvl="6" w:tplc="0809000F" w:tentative="1">
+      <w:start w:val="1"/>
+      <w:numFmt w:val="decimal"/>
+      <w:lvlText w:val="%7."/>
+      <w:lvlJc w:val="left"/>
+      <w:pPr>
+        <w:ind w:left="5040" w:hanging="360"/>
+      </w:pPr>
+    </w:lvl>
+    <w:lvl w:ilvl="7" w:tplc="08090019" w:tentative="1">
+      <w:start w:val="1"/>
+      <w:numFmt w:val="lowerLetter"/>
+      <w:lvlText w:val="%8."/>
+      <w:lvlJc w:val="left"/>
+      <w:pPr>
+        <w:ind w:left="5760" w:hanging="360"/>
+      </w:pPr>
+    </w:lvl>
+    <w:lvl w:ilvl="8" w:tplc="0809001B" w:tentative="1">
+      <w:start w:val="1"/>
+      <w:numFmt w:val="lowerRoman"/>
+      <w:lvlText w:val="%9."/>
+      <w:lvlJc w:val="right"/>
+      <w:pPr>
+        <w:ind w:left="6480" w:hanging="180"/>
+      </w:pPr>
+    </w:lvl>
+  </w:abstractNum>
+  <w:abstractNum w:abstractNumId="11" w15:restartNumberingAfterBreak="0">
     <w:nsid w:val="333D7A3E"/>
     <w:multiLevelType w:val="hybridMultilevel"/>
     <w:tmpl w:val="F198E660"/>
@@ -13410,7 +13606,7 @@
       </w:pPr>
     </w:lvl>
   </w:abstractNum>
-  <w:abstractNum w:abstractNumId="11" w15:restartNumberingAfterBreak="0">
+  <w:abstractNum w:abstractNumId="12" w15:restartNumberingAfterBreak="0">
     <w:nsid w:val="45D42475"/>
     <w:multiLevelType w:val="multilevel"/>
     <w:tmpl w:val="94867490"/>
@@ -13559,7 +13755,7 @@
       </w:rPr>
     </w:lvl>
   </w:abstractNum>
-  <w:abstractNum w:abstractNumId="12" w15:restartNumberingAfterBreak="0">
+  <w:abstractNum w:abstractNumId="13" w15:restartNumberingAfterBreak="0">
     <w:nsid w:val="4AE16929"/>
     <w:multiLevelType w:val="hybridMultilevel"/>
     <w:tmpl w:val="0BC6FB02"/>
@@ -13648,7 +13844,7 @@
       </w:pPr>
     </w:lvl>
   </w:abstractNum>
-  <w:abstractNum w:abstractNumId="13" w15:restartNumberingAfterBreak="0">
+  <w:abstractNum w:abstractNumId="14" w15:restartNumberingAfterBreak="0">
     <w:nsid w:val="4B8F7330"/>
     <w:multiLevelType w:val="multilevel"/>
     <w:tmpl w:val="86B07C14"/>
@@ -13797,7 +13993,7 @@
       </w:rPr>
     </w:lvl>
   </w:abstractNum>
-  <w:abstractNum w:abstractNumId="14" w15:restartNumberingAfterBreak="0">
+  <w:abstractNum w:abstractNumId="15" w15:restartNumberingAfterBreak="0">
     <w:nsid w:val="4E8E5320"/>
     <w:multiLevelType w:val="multilevel"/>
     <w:tmpl w:val="8C40FDA4"/>
@@ -13946,7 +14142,7 @@
       </w:rPr>
     </w:lvl>
   </w:abstractNum>
-  <w:abstractNum w:abstractNumId="15" w15:restartNumberingAfterBreak="0">
+  <w:abstractNum w:abstractNumId="16" w15:restartNumberingAfterBreak="0">
     <w:nsid w:val="4ED3475E"/>
     <w:multiLevelType w:val="multilevel"/>
     <w:tmpl w:val="457CF4BA"/>
@@ -14095,7 +14291,7 @@
       </w:rPr>
     </w:lvl>
   </w:abstractNum>
-  <w:abstractNum w:abstractNumId="16" w15:restartNumberingAfterBreak="0">
+  <w:abstractNum w:abstractNumId="17" w15:restartNumberingAfterBreak="0">
     <w:nsid w:val="5B23227D"/>
     <w:multiLevelType w:val="hybridMultilevel"/>
     <w:tmpl w:val="A7C6D8AE"/>
@@ -14208,7 +14404,7 @@
       </w:rPr>
     </w:lvl>
   </w:abstractNum>
-  <w:abstractNum w:abstractNumId="17" w15:restartNumberingAfterBreak="0">
+  <w:abstractNum w:abstractNumId="18" w15:restartNumberingAfterBreak="0">
     <w:nsid w:val="5CFB5BD0"/>
     <w:multiLevelType w:val="hybridMultilevel"/>
     <w:tmpl w:val="3DD6BFE4"/>
@@ -14321,7 +14517,7 @@
       </w:rPr>
     </w:lvl>
   </w:abstractNum>
-  <w:abstractNum w:abstractNumId="18" w15:restartNumberingAfterBreak="0">
+  <w:abstractNum w:abstractNumId="19" w15:restartNumberingAfterBreak="0">
     <w:nsid w:val="61931366"/>
     <w:multiLevelType w:val="hybridMultilevel"/>
     <w:tmpl w:val="13EA5170"/>
@@ -14434,7 +14630,7 @@
       </w:rPr>
     </w:lvl>
   </w:abstractNum>
-  <w:abstractNum w:abstractNumId="19" w15:restartNumberingAfterBreak="0">
+  <w:abstractNum w:abstractNumId="20" w15:restartNumberingAfterBreak="0">
     <w:nsid w:val="62F93CCE"/>
     <w:multiLevelType w:val="hybridMultilevel"/>
     <w:tmpl w:val="7FECE8D4"/>
@@ -14523,7 +14719,7 @@
       </w:pPr>
     </w:lvl>
   </w:abstractNum>
-  <w:abstractNum w:abstractNumId="20" w15:restartNumberingAfterBreak="0">
+  <w:abstractNum w:abstractNumId="21" w15:restartNumberingAfterBreak="0">
     <w:nsid w:val="664C4BE2"/>
     <w:multiLevelType w:val="hybridMultilevel"/>
     <w:tmpl w:val="26CA9C52"/>
@@ -14612,7 +14808,7 @@
       </w:pPr>
     </w:lvl>
   </w:abstractNum>
-  <w:abstractNum w:abstractNumId="21" w15:restartNumberingAfterBreak="0">
+  <w:abstractNum w:abstractNumId="22" w15:restartNumberingAfterBreak="0">
     <w:nsid w:val="66726260"/>
     <w:multiLevelType w:val="hybridMultilevel"/>
     <w:tmpl w:val="8B70CDEE"/>
@@ -14701,7 +14897,7 @@
       </w:pPr>
     </w:lvl>
   </w:abstractNum>
-  <w:abstractNum w:abstractNumId="22" w15:restartNumberingAfterBreak="0">
+  <w:abstractNum w:abstractNumId="23" w15:restartNumberingAfterBreak="0">
     <w:nsid w:val="68427343"/>
     <w:multiLevelType w:val="multilevel"/>
     <w:tmpl w:val="61965642"/>
@@ -14850,7 +15046,7 @@
       </w:rPr>
     </w:lvl>
   </w:abstractNum>
-  <w:abstractNum w:abstractNumId="23" w15:restartNumberingAfterBreak="0">
+  <w:abstractNum w:abstractNumId="24" w15:restartNumberingAfterBreak="0">
     <w:nsid w:val="69B45CEF"/>
     <w:multiLevelType w:val="multilevel"/>
     <w:tmpl w:val="2FD69B20"/>
@@ -14999,7 +15195,7 @@
       </w:rPr>
     </w:lvl>
   </w:abstractNum>
-  <w:abstractNum w:abstractNumId="24" w15:restartNumberingAfterBreak="0">
+  <w:abstractNum w:abstractNumId="25" w15:restartNumberingAfterBreak="0">
     <w:nsid w:val="6ADF33D0"/>
     <w:multiLevelType w:val="hybridMultilevel"/>
     <w:tmpl w:val="58042468"/>
@@ -15088,7 +15284,7 @@
       </w:pPr>
     </w:lvl>
   </w:abstractNum>
-  <w:abstractNum w:abstractNumId="25" w15:restartNumberingAfterBreak="0">
+  <w:abstractNum w:abstractNumId="26" w15:restartNumberingAfterBreak="0">
     <w:nsid w:val="6B735A93"/>
     <w:multiLevelType w:val="hybridMultilevel"/>
     <w:tmpl w:val="8B70CDEE"/>
@@ -15177,7 +15373,7 @@
       </w:pPr>
     </w:lvl>
   </w:abstractNum>
-  <w:abstractNum w:abstractNumId="26" w15:restartNumberingAfterBreak="0">
+  <w:abstractNum w:abstractNumId="27" w15:restartNumberingAfterBreak="0">
     <w:nsid w:val="6B7832EC"/>
     <w:multiLevelType w:val="multilevel"/>
     <w:tmpl w:val="A81A89CA"/>
@@ -15326,7 +15522,7 @@
       </w:rPr>
     </w:lvl>
   </w:abstractNum>
-  <w:abstractNum w:abstractNumId="27" w15:restartNumberingAfterBreak="0">
+  <w:abstractNum w:abstractNumId="28" w15:restartNumberingAfterBreak="0">
     <w:nsid w:val="73072708"/>
     <w:multiLevelType w:val="hybridMultilevel"/>
     <w:tmpl w:val="632CFC68"/>
@@ -15415,7 +15611,7 @@
       </w:pPr>
     </w:lvl>
   </w:abstractNum>
-  <w:abstractNum w:abstractNumId="28" w15:restartNumberingAfterBreak="0">
+  <w:abstractNum w:abstractNumId="29" w15:restartNumberingAfterBreak="0">
     <w:nsid w:val="73321BBA"/>
     <w:multiLevelType w:val="multilevel"/>
     <w:tmpl w:val="EFE6DFCA"/>
@@ -15564,7 +15760,7 @@
       </w:rPr>
     </w:lvl>
   </w:abstractNum>
-  <w:abstractNum w:abstractNumId="29" w15:restartNumberingAfterBreak="0">
+  <w:abstractNum w:abstractNumId="30" w15:restartNumberingAfterBreak="0">
     <w:nsid w:val="771B0A22"/>
     <w:multiLevelType w:val="hybridMultilevel"/>
     <w:tmpl w:val="5DA022BC"/>
@@ -15653,7 +15849,7 @@
       </w:pPr>
     </w:lvl>
   </w:abstractNum>
-  <w:abstractNum w:abstractNumId="30" w15:restartNumberingAfterBreak="0">
+  <w:abstractNum w:abstractNumId="31" w15:restartNumberingAfterBreak="0">
     <w:nsid w:val="78BD4B0A"/>
     <w:multiLevelType w:val="multilevel"/>
     <w:tmpl w:val="0E5AF6F0"/>
@@ -15802,7 +15998,7 @@
       </w:rPr>
     </w:lvl>
   </w:abstractNum>
-  <w:abstractNum w:abstractNumId="31" w15:restartNumberingAfterBreak="0">
+  <w:abstractNum w:abstractNumId="32" w15:restartNumberingAfterBreak="0">
     <w:nsid w:val="79FD2B7C"/>
     <w:multiLevelType w:val="multilevel"/>
     <w:tmpl w:val="FEC8E97E"/>
@@ -15952,37 +16148,37 @@
     </w:lvl>
   </w:abstractNum>
   <w:num w:numId="1" w16cid:durableId="1651977992">
-    <w:abstractNumId w:val="28"/>
+    <w:abstractNumId w:val="29"/>
   </w:num>
   <w:num w:numId="2" w16cid:durableId="222713874">
     <w:abstractNumId w:val="1"/>
   </w:num>
   <w:num w:numId="3" w16cid:durableId="1897811804">
-    <w:abstractNumId w:val="30"/>
+    <w:abstractNumId w:val="31"/>
   </w:num>
   <w:num w:numId="4" w16cid:durableId="480998893">
-    <w:abstractNumId w:val="15"/>
+    <w:abstractNumId w:val="16"/>
   </w:num>
   <w:num w:numId="5" w16cid:durableId="627710897">
-    <w:abstractNumId w:val="14"/>
+    <w:abstractNumId w:val="15"/>
   </w:num>
   <w:num w:numId="6" w16cid:durableId="1650670057">
     <w:abstractNumId w:val="6"/>
   </w:num>
   <w:num w:numId="7" w16cid:durableId="1062102917">
-    <w:abstractNumId w:val="26"/>
+    <w:abstractNumId w:val="27"/>
   </w:num>
   <w:num w:numId="8" w16cid:durableId="879586373">
     <w:abstractNumId w:val="8"/>
   </w:num>
   <w:num w:numId="9" w16cid:durableId="1369069069">
-    <w:abstractNumId w:val="22"/>
+    <w:abstractNumId w:val="23"/>
   </w:num>
   <w:num w:numId="10" w16cid:durableId="245656287">
-    <w:abstractNumId w:val="31"/>
+    <w:abstractNumId w:val="32"/>
   </w:num>
   <w:num w:numId="11" w16cid:durableId="435977825">
-    <w:abstractNumId w:val="11"/>
+    <w:abstractNumId w:val="12"/>
   </w:num>
   <w:num w:numId="12" w16cid:durableId="1315985183">
     <w:abstractNumId w:val="9"/>
@@ -15991,7 +16187,7 @@
     <w:abstractNumId w:val="5"/>
   </w:num>
   <w:num w:numId="14" w16cid:durableId="1310137639">
-    <w:abstractNumId w:val="13"/>
+    <w:abstractNumId w:val="14"/>
   </w:num>
   <w:num w:numId="15" w16cid:durableId="248657663">
     <w:abstractNumId w:val="7"/>
@@ -16000,16 +16196,16 @@
     <w:abstractNumId w:val="3"/>
   </w:num>
   <w:num w:numId="17" w16cid:durableId="1705866966">
-    <w:abstractNumId w:val="23"/>
+    <w:abstractNumId w:val="24"/>
   </w:num>
   <w:num w:numId="18" w16cid:durableId="1640526705">
-    <w:abstractNumId w:val="20"/>
+    <w:abstractNumId w:val="21"/>
   </w:num>
   <w:num w:numId="19" w16cid:durableId="1013218433">
-    <w:abstractNumId w:val="27"/>
+    <w:abstractNumId w:val="28"/>
   </w:num>
   <w:num w:numId="20" w16cid:durableId="1723140307">
-    <w:abstractNumId w:val="17"/>
+    <w:abstractNumId w:val="18"/>
   </w:num>
   <w:num w:numId="21" w16cid:durableId="474951159">
     <w:abstractNumId w:val="0"/>
@@ -16018,33 +16214,36 @@
     <w:abstractNumId w:val="2"/>
   </w:num>
   <w:num w:numId="23" w16cid:durableId="133723997">
-    <w:abstractNumId w:val="21"/>
+    <w:abstractNumId w:val="22"/>
   </w:num>
   <w:num w:numId="24" w16cid:durableId="135417014">
-    <w:abstractNumId w:val="25"/>
+    <w:abstractNumId w:val="26"/>
   </w:num>
   <w:num w:numId="25" w16cid:durableId="947009409">
-    <w:abstractNumId w:val="12"/>
+    <w:abstractNumId w:val="13"/>
   </w:num>
   <w:num w:numId="26" w16cid:durableId="1117262851">
-    <w:abstractNumId w:val="16"/>
+    <w:abstractNumId w:val="17"/>
   </w:num>
   <w:num w:numId="27" w16cid:durableId="1611358147">
-    <w:abstractNumId w:val="18"/>
+    <w:abstractNumId w:val="19"/>
   </w:num>
   <w:num w:numId="28" w16cid:durableId="984507323">
-    <w:abstractNumId w:val="19"/>
+    <w:abstractNumId w:val="20"/>
   </w:num>
   <w:num w:numId="29" w16cid:durableId="304311807">
-    <w:abstractNumId w:val="29"/>
+    <w:abstractNumId w:val="30"/>
   </w:num>
   <w:num w:numId="30" w16cid:durableId="649557697">
-    <w:abstractNumId w:val="24"/>
+    <w:abstractNumId w:val="25"/>
   </w:num>
   <w:num w:numId="31" w16cid:durableId="1511482807">
     <w:abstractNumId w:val="4"/>
   </w:num>
   <w:num w:numId="32" w16cid:durableId="1430465021">
+    <w:abstractNumId w:val="11"/>
+  </w:num>
+  <w:num w:numId="33" w16cid:durableId="821460038">
     <w:abstractNumId w:val="10"/>
   </w:num>
 </w:numbering>

</xml_diff>

<commit_message>
609 ended section 2
</commit_message>
<xml_diff>
--- a/2026-T3/B2-ICTSAD609-Plan_Monitor/2-Task2/611-Task2-section1.docx
+++ b/2026-T3/B2-ICTSAD609-Plan_Monitor/2-Task2/611-Task2-section1.docx
@@ -203,7 +203,14 @@
           <w:rFonts w:ascii="Arial" w:hAnsi="Arial" w:cs="Arial"/>
           <w:color w:val="000000" w:themeColor="text1"/>
         </w:rPr>
-        <w:t>Worlducation is a social startup founded in 2016, headquartered in Sydney's CBD, with a development team in Bulgaria, a manufacturing team in Hong Kong, and operations and marketing staff in Colombia, Egypt, Iceland, Russia, and the Philippines. The company manufactures AI-powered tablet computers for elementary school students and develops educational software, content, and activities designed to adapt to each child's individual learning progress.</w:t>
+        <w:t>It i</w:t>
+      </w:r>
+      <w:r>
+        <w:rPr>
+          <w:rFonts w:ascii="Arial" w:hAnsi="Arial" w:cs="Arial"/>
+          <w:color w:val="000000" w:themeColor="text1"/>
+        </w:rPr>
+        <w:t>s a social startup founded in 2016, headquartered in Sydney's CBD, with a development team in Bulgaria, a manufacturing team in Hong Kong, and operations and marketing staff in Colombia, Egypt, Iceland, Russia, and the Philippines. The company manufactures AI-powered tablet computers for elementary school students and develops educational software, content, and activities designed to adapt to each child's individual learning progress.</w:t>
       </w:r>
     </w:p>
     <w:p>
@@ -3618,6 +3625,42 @@
           <w:color w:val="000000" w:themeColor="text1"/>
         </w:rPr>
       </w:pPr>
+    </w:p>
+    <w:p>
+      <w:pPr>
+        <w:spacing w:after="160" w:line="278" w:lineRule="auto"/>
+        <w:rPr>
+          <w:rFonts w:ascii="Arial" w:hAnsi="Arial" w:cs="Arial"/>
+          <w:color w:val="000000" w:themeColor="text1"/>
+        </w:rPr>
+      </w:pPr>
+    </w:p>
+    <w:p>
+      <w:pPr>
+        <w:spacing w:after="160" w:line="278" w:lineRule="auto"/>
+        <w:rPr>
+          <w:rFonts w:ascii="Arial" w:hAnsi="Arial" w:cs="Arial"/>
+          <w:color w:val="000000" w:themeColor="text1"/>
+        </w:rPr>
+      </w:pPr>
+    </w:p>
+    <w:p>
+      <w:pPr>
+        <w:spacing w:after="160" w:line="278" w:lineRule="auto"/>
+        <w:rPr>
+          <w:rFonts w:ascii="Arial" w:hAnsi="Arial" w:cs="Arial"/>
+          <w:color w:val="000000" w:themeColor="text1"/>
+        </w:rPr>
+      </w:pPr>
+    </w:p>
+    <w:p>
+      <w:pPr>
+        <w:spacing w:after="160" w:line="278" w:lineRule="auto"/>
+        <w:rPr>
+          <w:rFonts w:ascii="Arial" w:hAnsi="Arial" w:cs="Arial"/>
+          <w:color w:val="000000" w:themeColor="text1"/>
+        </w:rPr>
+      </w:pPr>
       <w:r>
         <w:rPr>
           <w:rFonts w:ascii="Arial" w:hAnsi="Arial" w:cs="Arial"/>
@@ -3628,6 +3671,21 @@
     </w:p>
     <w:p>
       <w:pPr>
+        <w:pStyle w:val="Heading1"/>
+      </w:pPr>
+      <w:r>
+        <w:lastRenderedPageBreak/>
+        <w:t>STAKEHOLDER REGISTER</w:t>
+      </w:r>
+      <w:r>
+        <w:t xml:space="preserve"> &amp; </w:t>
+      </w:r>
+      <w:r>
+        <w:t>STAKEHOLDER ANALYSIS</w:t>
+      </w:r>
+    </w:p>
+    <w:p>
+      <w:pPr>
         <w:rPr>
           <w:rFonts w:ascii="Arial" w:hAnsi="Arial" w:cs="Arial"/>
           <w:b/>
@@ -3635,14 +3693,23 @@
           <w:color w:val="000000" w:themeColor="text1"/>
         </w:rPr>
       </w:pPr>
-      <w:r>
+    </w:p>
+    <w:p>
+      <w:pPr>
         <w:rPr>
           <w:rFonts w:ascii="Arial" w:hAnsi="Arial" w:cs="Arial"/>
           <w:b/>
           <w:bCs/>
           <w:color w:val="000000" w:themeColor="text1"/>
         </w:rPr>
-        <w:lastRenderedPageBreak/>
+      </w:pPr>
+      <w:r>
+        <w:rPr>
+          <w:rFonts w:ascii="Arial" w:hAnsi="Arial" w:cs="Arial"/>
+          <w:b/>
+          <w:bCs/>
+          <w:color w:val="000000" w:themeColor="text1"/>
+        </w:rPr>
         <w:t>Identification of stakeholders</w:t>
       </w:r>
     </w:p>
@@ -5214,7 +5281,15 @@
                 <w:rFonts w:ascii="Arial" w:hAnsi="Arial" w:cs="Arial"/>
                 <w:color w:val="000000" w:themeColor="text1"/>
               </w:rPr>
-              <w:t>Authorises all financial transactions per Finance Authorisation Policy; approves $2M cloud investment (Init. 1) and all supplier commitments (Init. 2)</w:t>
+              <w:t xml:space="preserve">Authorises all financial transactions per Finance Authorisation Policy; approves $2M cloud </w:t>
+            </w:r>
+            <w:r>
+              <w:rPr>
+                <w:rFonts w:ascii="Arial" w:hAnsi="Arial" w:cs="Arial"/>
+                <w:color w:val="000000" w:themeColor="text1"/>
+              </w:rPr>
+              <w:lastRenderedPageBreak/>
+              <w:t>investment (Init. 1) and all supplier commitments (Init. 2)</w:t>
             </w:r>
           </w:p>
         </w:tc>
@@ -5237,7 +5312,6 @@
                 <w:rFonts w:ascii="Arial" w:hAnsi="Arial" w:cs="Arial"/>
                 <w:color w:val="000000" w:themeColor="text1"/>
               </w:rPr>
-              <w:lastRenderedPageBreak/>
               <w:t>Divya Sapra (IT Supervisor)</w:t>
             </w:r>
           </w:p>
@@ -6919,6 +6993,7 @@
     </w:p>
     <w:p>
       <w:pPr>
+        <w:spacing w:after="160" w:line="278" w:lineRule="auto"/>
         <w:rPr>
           <w:rFonts w:ascii="Arial" w:hAnsi="Arial" w:cs="Arial"/>
           <w:b/>
@@ -6933,6 +7008,26 @@
           <w:bCs/>
           <w:color w:val="000000" w:themeColor="text1"/>
         </w:rPr>
+        <w:br w:type="page"/>
+      </w:r>
+    </w:p>
+    <w:p>
+      <w:pPr>
+        <w:rPr>
+          <w:rFonts w:ascii="Arial" w:hAnsi="Arial" w:cs="Arial"/>
+          <w:b/>
+          <w:bCs/>
+          <w:color w:val="000000" w:themeColor="text1"/>
+        </w:rPr>
+      </w:pPr>
+      <w:r>
+        <w:rPr>
+          <w:rFonts w:ascii="Arial" w:hAnsi="Arial" w:cs="Arial"/>
+          <w:b/>
+          <w:bCs/>
+          <w:color w:val="000000" w:themeColor="text1"/>
+        </w:rPr>
+        <w:lastRenderedPageBreak/>
         <w:t>Stakeholders with Authority Over Business Analysis Activities</w:t>
       </w:r>
     </w:p>
@@ -6976,7 +7071,6 @@
           <w:rFonts w:ascii="Arial" w:hAnsi="Arial" w:cs="Arial"/>
           <w:color w:val="000000" w:themeColor="text1"/>
         </w:rPr>
-        <w:lastRenderedPageBreak/>
         <w:t>Lucas López (CEO/Founder) – Both initiatives</w:t>
       </w:r>
     </w:p>
@@ -7419,6 +7513,7 @@
                 <w:bCs/>
                 <w:color w:val="000000" w:themeColor="text1"/>
               </w:rPr>
+              <w:lastRenderedPageBreak/>
               <w:t>Role</w:t>
             </w:r>
           </w:p>
@@ -7583,15 +7678,7 @@
                 <w:rFonts w:ascii="Arial" w:hAnsi="Arial" w:cs="Arial"/>
                 <w:color w:val="000000" w:themeColor="text1"/>
               </w:rPr>
-              <w:t xml:space="preserve">Plans and executes all business analysis activities; elicits and documents requirements; </w:t>
-            </w:r>
-            <w:r>
-              <w:rPr>
-                <w:rFonts w:ascii="Arial" w:hAnsi="Arial" w:cs="Arial"/>
-                <w:color w:val="000000" w:themeColor="text1"/>
-              </w:rPr>
-              <w:lastRenderedPageBreak/>
-              <w:t>manages stakeholder engagement across both initiatives</w:t>
+              <w:t>Plans and executes all business analysis activities; elicits and documents requirements; manages stakeholder engagement across both initiatives</w:t>
             </w:r>
           </w:p>
         </w:tc>
@@ -7614,7 +7701,6 @@
                 <w:rFonts w:ascii="Arial" w:hAnsi="Arial" w:cs="Arial"/>
                 <w:color w:val="000000" w:themeColor="text1"/>
               </w:rPr>
-              <w:lastRenderedPageBreak/>
               <w:t>IT Professional Supervisor</w:t>
             </w:r>
           </w:p>
@@ -8485,6 +8571,7 @@
           <w:rFonts w:ascii="Arial" w:hAnsi="Arial" w:cs="Arial"/>
           <w:color w:val="000000" w:themeColor="text1"/>
         </w:rPr>
+        <w:lastRenderedPageBreak/>
         <w:t>Noah Jones (Operations Manager) expressed concerns regarding workforce transition, operating cost projections and requested a Workforce Impact Analysis, a B2C Cost Audit, and a Risk Mitigation Plan.</w:t>
       </w:r>
     </w:p>
@@ -8914,7 +9001,15 @@
           <w:rFonts w:ascii="Arial" w:hAnsi="Arial" w:cs="Arial"/>
           <w:color w:val="000000" w:themeColor="text1"/>
         </w:rPr>
-        <w:t xml:space="preserve"> (Sales Team Manager): She was concerned about quality assurance to the more than 550 schools that are current clients. He agreed that the lost margin of $200 per outsourced unit is preferable to losing customers, but it required strict countermeasures. It demanded the design of Service Level Agreements (SLA) for hardware quality control, as well as definitive and reliable delivery schedules for the 1,500 tablets that are still backlogged from 2020.</w:t>
+        <w:t xml:space="preserve"> (Sales Team Manager): She was concerned about quality assurance to the more than 550 schools that are current clients. He agreed that the lost margin of $200 per outsourced unit is preferable to losing customers, but it required strict countermeasures. It demanded the design of Service Level Agreements (SLA) for hardware quality control, as </w:t>
+      </w:r>
+      <w:r>
+        <w:rPr>
+          <w:rFonts w:ascii="Arial" w:hAnsi="Arial" w:cs="Arial"/>
+          <w:color w:val="000000" w:themeColor="text1"/>
+        </w:rPr>
+        <w:lastRenderedPageBreak/>
+        <w:t>well as definitive and reliable delivery schedules for the 1,500 tablets that are still backlogged from 2020.</w:t>
       </w:r>
     </w:p>
     <w:p>

</xml_diff>

<commit_message>
609 doing section 3
</commit_message>
<xml_diff>
--- a/2026-T3/B2-ICTSAD609-Plan_Monitor/2-Task2/611-Task2-section1.docx
+++ b/2026-T3/B2-ICTSAD609-Plan_Monitor/2-Task2/611-Task2-section1.docx
@@ -4810,6 +4810,134 @@
                 <w:color w:val="000000" w:themeColor="text1"/>
               </w:rPr>
               <w:t>Initiative 2 only</w:t>
+            </w:r>
+          </w:p>
+        </w:tc>
+      </w:tr>
+      <w:tr>
+        <w:tc>
+          <w:tcPr>
+            <w:tcW w:w="0" w:type="auto"/>
+          </w:tcPr>
+          <w:p>
+            <w:pPr>
+              <w:rPr>
+                <w:rFonts w:ascii="Arial" w:hAnsi="Arial" w:cs="Arial"/>
+                <w:color w:val="000000" w:themeColor="text1"/>
+                <w:highlight w:val="yellow"/>
+              </w:rPr>
+            </w:pPr>
+            <w:r>
+              <w:rPr>
+                <w:rFonts w:ascii="Arial" w:hAnsi="Arial" w:cs="Arial"/>
+                <w:color w:val="000000" w:themeColor="text1"/>
+                <w:highlight w:val="yellow"/>
+              </w:rPr>
+              <w:t xml:space="preserve">Sarah Jenkins (Lead GRC Consultant - </w:t>
+            </w:r>
+            <w:proofErr w:type="spellStart"/>
+            <w:r>
+              <w:rPr>
+                <w:rFonts w:ascii="Arial" w:hAnsi="Arial" w:cs="Arial"/>
+                <w:color w:val="000000" w:themeColor="text1"/>
+                <w:highlight w:val="yellow"/>
+              </w:rPr>
+              <w:t>Sentrient</w:t>
+            </w:r>
+            <w:proofErr w:type="spellEnd"/>
+            <w:r>
+              <w:rPr>
+                <w:rFonts w:ascii="Arial" w:hAnsi="Arial" w:cs="Arial"/>
+                <w:color w:val="000000" w:themeColor="text1"/>
+                <w:highlight w:val="yellow"/>
+              </w:rPr>
+              <w:t>)</w:t>
+            </w:r>
+          </w:p>
+        </w:tc>
+        <w:tc>
+          <w:tcPr>
+            <w:tcW w:w="0" w:type="auto"/>
+          </w:tcPr>
+          <w:p>
+            <w:pPr>
+              <w:rPr>
+                <w:rFonts w:ascii="Arial" w:hAnsi="Arial" w:cs="Arial"/>
+                <w:color w:val="000000" w:themeColor="text1"/>
+                <w:highlight w:val="yellow"/>
+              </w:rPr>
+            </w:pPr>
+            <w:r>
+              <w:rPr>
+                <w:rFonts w:ascii="Arial" w:hAnsi="Arial" w:cs="Arial"/>
+                <w:color w:val="000000" w:themeColor="text1"/>
+                <w:highlight w:val="yellow"/>
+              </w:rPr>
+              <w:t>Both</w:t>
+            </w:r>
+          </w:p>
+        </w:tc>
+      </w:tr>
+      <w:tr>
+        <w:tc>
+          <w:tcPr>
+            <w:tcW w:w="0" w:type="auto"/>
+          </w:tcPr>
+          <w:p>
+            <w:pPr>
+              <w:rPr>
+                <w:rFonts w:ascii="Arial" w:hAnsi="Arial" w:cs="Arial"/>
+                <w:color w:val="000000" w:themeColor="text1"/>
+                <w:highlight w:val="yellow"/>
+              </w:rPr>
+            </w:pPr>
+            <w:r>
+              <w:rPr>
+                <w:rFonts w:ascii="Arial" w:hAnsi="Arial" w:cs="Arial"/>
+                <w:color w:val="000000" w:themeColor="text1"/>
+                <w:highlight w:val="yellow"/>
+              </w:rPr>
+              <w:t xml:space="preserve">David Chen (Systems Integration Specialist - </w:t>
+            </w:r>
+            <w:proofErr w:type="spellStart"/>
+            <w:r>
+              <w:rPr>
+                <w:rFonts w:ascii="Arial" w:hAnsi="Arial" w:cs="Arial"/>
+                <w:color w:val="000000" w:themeColor="text1"/>
+                <w:highlight w:val="yellow"/>
+              </w:rPr>
+              <w:t>Sentrient</w:t>
+            </w:r>
+            <w:proofErr w:type="spellEnd"/>
+            <w:r>
+              <w:rPr>
+                <w:rFonts w:ascii="Arial" w:hAnsi="Arial" w:cs="Arial"/>
+                <w:color w:val="000000" w:themeColor="text1"/>
+                <w:highlight w:val="yellow"/>
+              </w:rPr>
+              <w:t>)</w:t>
+            </w:r>
+          </w:p>
+        </w:tc>
+        <w:tc>
+          <w:tcPr>
+            <w:tcW w:w="0" w:type="auto"/>
+          </w:tcPr>
+          <w:p>
+            <w:pPr>
+              <w:rPr>
+                <w:rFonts w:ascii="Arial" w:hAnsi="Arial" w:cs="Arial"/>
+                <w:color w:val="000000" w:themeColor="text1"/>
+                <w:highlight w:val="yellow"/>
+              </w:rPr>
+            </w:pPr>
+            <w:r>
+              <w:rPr>
+                <w:rFonts w:ascii="Arial" w:hAnsi="Arial" w:cs="Arial"/>
+                <w:color w:val="000000" w:themeColor="text1"/>
+                <w:highlight w:val="yellow"/>
+              </w:rPr>
+              <w:t>Both</w:t>
             </w:r>
           </w:p>
         </w:tc>
@@ -5176,6 +5304,7 @@
                 <w:rFonts w:ascii="Arial" w:hAnsi="Arial" w:cs="Arial"/>
                 <w:color w:val="000000" w:themeColor="text1"/>
               </w:rPr>
+              <w:lastRenderedPageBreak/>
               <w:t>Anna Armstrong (Finance Manager)</w:t>
             </w:r>
           </w:p>
@@ -5281,15 +5410,7 @@
                 <w:rFonts w:ascii="Arial" w:hAnsi="Arial" w:cs="Arial"/>
                 <w:color w:val="000000" w:themeColor="text1"/>
               </w:rPr>
-              <w:t xml:space="preserve">Authorises all financial transactions per Finance Authorisation Policy; approves $2M cloud </w:t>
-            </w:r>
-            <w:r>
-              <w:rPr>
-                <w:rFonts w:ascii="Arial" w:hAnsi="Arial" w:cs="Arial"/>
-                <w:color w:val="000000" w:themeColor="text1"/>
-              </w:rPr>
-              <w:lastRenderedPageBreak/>
-              <w:t>investment (Init. 1) and all supplier commitments (Init. 2)</w:t>
+              <w:t>Authorises all financial transactions per Finance Authorisation Policy; approves $2M cloud investment (Init. 1) and all supplier commitments (Init. 2)</w:t>
             </w:r>
           </w:p>
         </w:tc>
@@ -6969,7 +7090,15 @@
                 <w:rFonts w:ascii="Arial" w:hAnsi="Arial" w:cs="Arial"/>
                 <w:color w:val="000000" w:themeColor="text1"/>
               </w:rPr>
-              <w:t>Regulatory compliance oversight for student data privacy under the Privacy Act 1988</w:t>
+              <w:t xml:space="preserve">Regulatory compliance oversight for student data </w:t>
+            </w:r>
+            <w:r>
+              <w:rPr>
+                <w:rFonts w:ascii="Arial" w:hAnsi="Arial" w:cs="Arial"/>
+                <w:color w:val="000000" w:themeColor="text1"/>
+              </w:rPr>
+              <w:lastRenderedPageBreak/>
+              <w:t>privacy under the Privacy Act 1988</w:t>
             </w:r>
           </w:p>
         </w:tc>
@@ -7424,6 +7553,7 @@
     </w:p>
     <w:p>
       <w:pPr>
+        <w:spacing w:after="160" w:line="278" w:lineRule="auto"/>
         <w:rPr>
           <w:rFonts w:ascii="Arial" w:hAnsi="Arial" w:cs="Arial"/>
           <w:b/>
@@ -7438,6 +7568,26 @@
           <w:bCs/>
           <w:color w:val="000000" w:themeColor="text1"/>
         </w:rPr>
+        <w:br w:type="page"/>
+      </w:r>
+    </w:p>
+    <w:p>
+      <w:pPr>
+        <w:rPr>
+          <w:rFonts w:ascii="Arial" w:hAnsi="Arial" w:cs="Arial"/>
+          <w:b/>
+          <w:bCs/>
+          <w:color w:val="000000" w:themeColor="text1"/>
+        </w:rPr>
+      </w:pPr>
+      <w:r>
+        <w:rPr>
+          <w:rFonts w:ascii="Arial" w:hAnsi="Arial" w:cs="Arial"/>
+          <w:b/>
+          <w:bCs/>
+          <w:color w:val="000000" w:themeColor="text1"/>
+        </w:rPr>
+        <w:lastRenderedPageBreak/>
         <w:t>Establish Process Needs</w:t>
       </w:r>
     </w:p>
@@ -7513,7 +7663,6 @@
                 <w:bCs/>
                 <w:color w:val="000000" w:themeColor="text1"/>
               </w:rPr>
-              <w:lastRenderedPageBreak/>
               <w:t>Role</w:t>
             </w:r>
           </w:p>
@@ -8571,7 +8720,6 @@
           <w:rFonts w:ascii="Arial" w:hAnsi="Arial" w:cs="Arial"/>
           <w:color w:val="000000" w:themeColor="text1"/>
         </w:rPr>
-        <w:lastRenderedPageBreak/>
         <w:t>Noah Jones (Operations Manager) expressed concerns regarding workforce transition, operating cost projections and requested a Workforce Impact Analysis, a B2C Cost Audit, and a Risk Mitigation Plan.</w:t>
       </w:r>
     </w:p>
@@ -9001,7 +9149,7 @@
           <w:rFonts w:ascii="Arial" w:hAnsi="Arial" w:cs="Arial"/>
           <w:color w:val="000000" w:themeColor="text1"/>
         </w:rPr>
-        <w:t xml:space="preserve"> (Sales Team Manager): She was concerned about quality assurance to the more than 550 schools that are current clients. He agreed that the lost margin of $200 per outsourced unit is preferable to losing customers, but it required strict countermeasures. It demanded the design of Service Level Agreements (SLA) for hardware quality control, as </w:t>
+        <w:t xml:space="preserve"> (Sales Team Manager): She was concerned about quality assurance to the more than 550 schools that are current clients. He agreed that the lost margin of $200 per </w:t>
       </w:r>
       <w:r>
         <w:rPr>
@@ -9009,7 +9157,7 @@
           <w:color w:val="000000" w:themeColor="text1"/>
         </w:rPr>
         <w:lastRenderedPageBreak/>
-        <w:t>well as definitive and reliable delivery schedules for the 1,500 tablets that are still backlogged from 2020.</w:t>
+        <w:t>outsourced unit is preferable to losing customers, but it required strict countermeasures. It demanded the design of Service Level Agreements (SLA) for hardware quality control, as well as definitive and reliable delivery schedules for the 1,500 tablets that are still backlogged from 2020.</w:t>
       </w:r>
     </w:p>
     <w:p>

</xml_diff>

<commit_message>
609 eding section 3
</commit_message>
<xml_diff>
--- a/2026-T3/B2-ICTSAD609-Plan_Monitor/2-Task2/611-Task2-section1.docx
+++ b/2026-T3/B2-ICTSAD609-Plan_Monitor/2-Task2/611-Task2-section1.docx
@@ -4829,6 +4829,22 @@
             </w:pPr>
             <w:r>
               <w:rPr>
+                <w:rFonts w:ascii="Calibri" w:hAnsi="Calibri" w:cs="Calibri"/>
+                <w:color w:val="000000"/>
+                <w:highlight w:val="yellow"/>
+              </w:rPr>
+              <w:t xml:space="preserve">Change added: </w:t>
+            </w:r>
+            <w:r>
+              <w:rPr>
+                <w:rFonts w:ascii="Calibri" w:hAnsi="Calibri" w:cs="Calibri"/>
+                <w:color w:val="000000"/>
+                <w:highlight w:val="yellow"/>
+              </w:rPr>
+              <w:t xml:space="preserve"> </w:t>
+            </w:r>
+            <w:r>
+              <w:rPr>
                 <w:rFonts w:ascii="Arial" w:hAnsi="Arial" w:cs="Arial"/>
                 <w:color w:val="000000" w:themeColor="text1"/>
                 <w:highlight w:val="yellow"/>
@@ -4891,6 +4907,22 @@
                 <w:highlight w:val="yellow"/>
               </w:rPr>
             </w:pPr>
+            <w:r>
+              <w:rPr>
+                <w:rFonts w:ascii="Calibri" w:hAnsi="Calibri" w:cs="Calibri"/>
+                <w:color w:val="000000"/>
+                <w:highlight w:val="yellow"/>
+              </w:rPr>
+              <w:t xml:space="preserve">Change added: </w:t>
+            </w:r>
+            <w:r>
+              <w:rPr>
+                <w:rFonts w:ascii="Calibri" w:hAnsi="Calibri" w:cs="Calibri"/>
+                <w:color w:val="000000"/>
+                <w:highlight w:val="yellow"/>
+              </w:rPr>
+              <w:t xml:space="preserve"> </w:t>
+            </w:r>
             <w:r>
               <w:rPr>
                 <w:rFonts w:ascii="Arial" w:hAnsi="Arial" w:cs="Arial"/>

</xml_diff>